<commit_message>
update 2 because of the byutr.h file not being updated
</commit_message>
<xml_diff>
--- a/PEX3_Report_Template.docx
+++ b/PEX3_Report_Template.docx
@@ -68,7 +68,61 @@
     </w:p>
     <w:p>
       <w:r>
-        <w:t xml:space="preserve">A 2KB frame size is recommended, along with 685 frames at a minimum to keep the fault-rate below 10%. When simulating the fault-rate, 685 frames at a size of 2KB kept the fault rate below 10% and reduced the overhead calculations by the largest amount. 1KB frame sizes are more efficient by themselves, by calculating the total size of frames needed there are almost over double the number of frames, which increases the overhead to manage them. The additional fault-rate performance gained by the 1KB frame size is not worth the much larger overhead of the 2KB size. </w:t>
+        <w:t xml:space="preserve">A </w:t>
+      </w:r>
+      <w:r>
+        <w:t>1</w:t>
+      </w:r>
+      <w:r>
+        <w:t xml:space="preserve">KB frame size is recommended, along with </w:t>
+      </w:r>
+      <w:r>
+        <w:t>318</w:t>
+      </w:r>
+      <w:r>
+        <w:t xml:space="preserve"> frames at a minimum to keep the fault-rate below 10%. When simulating the fault-rate, </w:t>
+      </w:r>
+      <w:r>
+        <w:t>318</w:t>
+      </w:r>
+      <w:r>
+        <w:t xml:space="preserve"> frames at a size of </w:t>
+      </w:r>
+      <w:r>
+        <w:t>1</w:t>
+      </w:r>
+      <w:r>
+        <w:t xml:space="preserve">KB kept the fault rate below 10% and reduced the overhead calculations by the largest amount. </w:t>
+      </w:r>
+      <w:r>
+        <w:t>2</w:t>
+      </w:r>
+      <w:r>
+        <w:t>KB frame sizes are more efficient by themselves</w:t>
+      </w:r>
+      <w:r>
+        <w:t xml:space="preserve"> and require less total frames</w:t>
+      </w:r>
+      <w:r>
+        <w:t xml:space="preserve">, </w:t>
+      </w:r>
+      <w:r>
+        <w:t>it is not a proportional decrease in frames needed against the total memory used</w:t>
+      </w:r>
+      <w:r>
+        <w:t xml:space="preserve">. The additional fault-rate performance gained by the </w:t>
+      </w:r>
+      <w:r>
+        <w:t>2</w:t>
+      </w:r>
+      <w:r>
+        <w:t xml:space="preserve">KB frame size is not worth the much larger overhead of the </w:t>
+      </w:r>
+      <w:r>
+        <w:t>2</w:t>
+      </w:r>
+      <w:r>
+        <w:t xml:space="preserve">KB size. </w:t>
       </w:r>
     </w:p>
     <w:p>
@@ -164,7 +218,7 @@
               <w:cnfStyle w:val="000000100000" w:firstRow="0" w:lastRow="0" w:firstColumn="0" w:lastColumn="0" w:oddVBand="0" w:evenVBand="0" w:oddHBand="1" w:evenHBand="0" w:firstRowFirstColumn="0" w:firstRowLastColumn="0" w:lastRowFirstColumn="0" w:lastRowLastColumn="0"/>
             </w:pPr>
             <w:r>
-              <w:t>2974</w:t>
+              <w:t>689</w:t>
             </w:r>
           </w:p>
         </w:tc>
@@ -207,7 +261,7 @@
               <w:cnfStyle w:val="000000010000" w:firstRow="0" w:lastRow="0" w:firstColumn="0" w:lastColumn="0" w:oddVBand="0" w:evenVBand="0" w:oddHBand="0" w:evenHBand="1" w:firstRowFirstColumn="0" w:firstRowLastColumn="0" w:lastRowFirstColumn="0" w:lastRowLastColumn="0"/>
             </w:pPr>
             <w:r>
-              <w:t>1319</w:t>
+              <w:t>318</w:t>
             </w:r>
           </w:p>
         </w:tc>
@@ -250,7 +304,7 @@
               <w:cnfStyle w:val="000000100000" w:firstRow="0" w:lastRow="0" w:firstColumn="0" w:lastColumn="0" w:oddVBand="0" w:evenVBand="0" w:oddHBand="1" w:evenHBand="0" w:firstRowFirstColumn="0" w:firstRowLastColumn="0" w:lastRowFirstColumn="0" w:lastRowLastColumn="0"/>
             </w:pPr>
             <w:r>
-              <w:t>685</w:t>
+              <w:t>179</w:t>
             </w:r>
           </w:p>
         </w:tc>
@@ -263,7 +317,13 @@
               <w:cnfStyle w:val="000000100000" w:firstRow="0" w:lastRow="0" w:firstColumn="0" w:lastColumn="0" w:oddVBand="0" w:evenVBand="0" w:oddHBand="1" w:evenHBand="0" w:firstRowFirstColumn="0" w:firstRowLastColumn="0" w:lastRowFirstColumn="0" w:lastRowLastColumn="0"/>
             </w:pPr>
             <w:r>
-              <w:t>9.99%</w:t>
+              <w:t>9.9</w:t>
+            </w:r>
+            <w:r>
+              <w:t>7</w:t>
+            </w:r>
+            <w:r>
+              <w:t>%</w:t>
             </w:r>
           </w:p>
         </w:tc>
@@ -293,7 +353,7 @@
               <w:cnfStyle w:val="000000010000" w:firstRow="0" w:lastRow="0" w:firstColumn="0" w:lastColumn="0" w:oddVBand="0" w:evenVBand="0" w:oddHBand="0" w:evenHBand="1" w:firstRowFirstColumn="0" w:firstRowLastColumn="0" w:lastRowFirstColumn="0" w:lastRowLastColumn="0"/>
             </w:pPr>
             <w:r>
-              <w:t>380</w:t>
+              <w:t>106</w:t>
             </w:r>
           </w:p>
         </w:tc>
@@ -338,10 +398,10 @@
     <w:p>
       <w:r>
         <w:drawing>
-          <wp:inline distT="0" distB="0" distL="0" distR="0" wp14:anchorId="56BFED7C" wp14:editId="3023B16D">
-            <wp:extent cx="5486400" cy="2602865"/>
-            <wp:effectExtent l="0" t="0" r="0" b="6985"/>
-            <wp:docPr id="1874680304" name="Picture 1"/>
+          <wp:inline distT="0" distB="0" distL="0" distR="0" wp14:anchorId="1DFE30E8" wp14:editId="78463B2A">
+            <wp:extent cx="5493434" cy="3054987"/>
+            <wp:effectExtent l="0" t="0" r="0" b="0"/>
+            <wp:docPr id="1219490902" name="Picture 1"/>
             <wp:cNvGraphicFramePr>
               <a:graphicFrameLocks xmlns:a="http://schemas.openxmlformats.org/drawingml/2006/main" noChangeAspect="1"/>
             </wp:cNvGraphicFramePr>
@@ -349,7 +409,7 @@
               <a:graphicData uri="http://schemas.openxmlformats.org/drawingml/2006/picture">
                 <pic:pic xmlns:pic="http://schemas.openxmlformats.org/drawingml/2006/picture">
                   <pic:nvPicPr>
-                    <pic:cNvPr id="1874680304" name=""/>
+                    <pic:cNvPr id="1219490902" name=""/>
                     <pic:cNvPicPr/>
                   </pic:nvPicPr>
                   <pic:blipFill>
@@ -361,7 +421,7 @@
                   <pic:spPr>
                     <a:xfrm>
                       <a:off x="0" y="0"/>
-                      <a:ext cx="5486400" cy="2602865"/>
+                      <a:ext cx="5497285" cy="3057129"/>
                     </a:xfrm>
                     <a:prstGeom prst="rect">
                       <a:avLst/>
@@ -385,10 +445,10 @@
     <w:p>
       <w:r>
         <w:drawing>
-          <wp:inline distT="0" distB="0" distL="0" distR="0" wp14:anchorId="17D49A36" wp14:editId="4655EA5A">
-            <wp:extent cx="5486400" cy="2589530"/>
-            <wp:effectExtent l="0" t="0" r="0" b="1270"/>
-            <wp:docPr id="745734349" name="Picture 1"/>
+          <wp:inline distT="0" distB="0" distL="0" distR="0" wp14:anchorId="4437967B" wp14:editId="2EEB1B7D">
+            <wp:extent cx="5486400" cy="2556510"/>
+            <wp:effectExtent l="0" t="0" r="0" b="0"/>
+            <wp:docPr id="1663294137" name="Picture 1"/>
             <wp:cNvGraphicFramePr>
               <a:graphicFrameLocks xmlns:a="http://schemas.openxmlformats.org/drawingml/2006/main" noChangeAspect="1"/>
             </wp:cNvGraphicFramePr>
@@ -396,7 +456,7 @@
               <a:graphicData uri="http://schemas.openxmlformats.org/drawingml/2006/picture">
                 <pic:pic xmlns:pic="http://schemas.openxmlformats.org/drawingml/2006/picture">
                   <pic:nvPicPr>
-                    <pic:cNvPr id="745734349" name=""/>
+                    <pic:cNvPr id="1663294137" name=""/>
                     <pic:cNvPicPr/>
                   </pic:nvPicPr>
                   <pic:blipFill>
@@ -408,7 +468,7 @@
                   <pic:spPr>
                     <a:xfrm>
                       <a:off x="0" y="0"/>
-                      <a:ext cx="5486400" cy="2589530"/>
+                      <a:ext cx="5486400" cy="2556510"/>
                     </a:xfrm>
                     <a:prstGeom prst="rect">
                       <a:avLst/>
@@ -433,10 +493,10 @@
     <w:p>
       <w:r>
         <w:drawing>
-          <wp:inline distT="0" distB="0" distL="0" distR="0" wp14:anchorId="337C710B" wp14:editId="3EC308EF">
-            <wp:extent cx="5486400" cy="2705735"/>
+          <wp:inline distT="0" distB="0" distL="0" distR="0" wp14:anchorId="0ECADBAA" wp14:editId="04BFDE22">
+            <wp:extent cx="5486400" cy="2712720"/>
             <wp:effectExtent l="0" t="0" r="0" b="0"/>
-            <wp:docPr id="768911467" name="Picture 1"/>
+            <wp:docPr id="1631970076" name="Picture 1"/>
             <wp:cNvGraphicFramePr>
               <a:graphicFrameLocks xmlns:a="http://schemas.openxmlformats.org/drawingml/2006/main" noChangeAspect="1"/>
             </wp:cNvGraphicFramePr>
@@ -444,7 +504,7 @@
               <a:graphicData uri="http://schemas.openxmlformats.org/drawingml/2006/picture">
                 <pic:pic xmlns:pic="http://schemas.openxmlformats.org/drawingml/2006/picture">
                   <pic:nvPicPr>
-                    <pic:cNvPr id="768911467" name=""/>
+                    <pic:cNvPr id="1631970076" name=""/>
                     <pic:cNvPicPr/>
                   </pic:nvPicPr>
                   <pic:blipFill>
@@ -456,7 +516,7 @@
                   <pic:spPr>
                     <a:xfrm>
                       <a:off x="0" y="0"/>
-                      <a:ext cx="5486400" cy="2705735"/>
+                      <a:ext cx="5486400" cy="2712720"/>
                     </a:xfrm>
                     <a:prstGeom prst="rect">
                       <a:avLst/>
@@ -482,15 +542,11 @@
         <w:jc w:val="center"/>
       </w:pPr>
       <w:r>
-        <w:rPr>
-          <w:i/>
-          <w:color w:val="888888"/>
-        </w:rPr>
         <w:drawing>
-          <wp:inline distT="0" distB="0" distL="0" distR="0" wp14:anchorId="13F1D226" wp14:editId="3B88CE29">
-            <wp:extent cx="5486400" cy="2657475"/>
-            <wp:effectExtent l="0" t="0" r="0" b="9525"/>
-            <wp:docPr id="1747340774" name="Picture 1"/>
+          <wp:inline distT="0" distB="0" distL="0" distR="0" wp14:anchorId="2CDEAEC2" wp14:editId="2ED5DD91">
+            <wp:extent cx="5486400" cy="2614930"/>
+            <wp:effectExtent l="0" t="0" r="0" b="0"/>
+            <wp:docPr id="1974162225" name="Picture 1"/>
             <wp:cNvGraphicFramePr>
               <a:graphicFrameLocks xmlns:a="http://schemas.openxmlformats.org/drawingml/2006/main" noChangeAspect="1"/>
             </wp:cNvGraphicFramePr>
@@ -498,7 +554,7 @@
               <a:graphicData uri="http://schemas.openxmlformats.org/drawingml/2006/picture">
                 <pic:pic xmlns:pic="http://schemas.openxmlformats.org/drawingml/2006/picture">
                   <pic:nvPicPr>
-                    <pic:cNvPr id="1747340774" name=""/>
+                    <pic:cNvPr id="1974162225" name=""/>
                     <pic:cNvPicPr/>
                   </pic:nvPicPr>
                   <pic:blipFill>
@@ -510,7 +566,7 @@
                   <pic:spPr>
                     <a:xfrm>
                       <a:off x="0" y="0"/>
-                      <a:ext cx="5486400" cy="2657475"/>
+                      <a:ext cx="5486400" cy="2614930"/>
                     </a:xfrm>
                     <a:prstGeom prst="rect">
                       <a:avLst/>
@@ -548,15 +604,11 @@
     </w:p>
     <w:p>
       <w:r>
-        <w:rPr>
-          <w:i/>
-          <w:color w:val="888888"/>
-        </w:rPr>
         <w:drawing>
-          <wp:inline distT="0" distB="0" distL="0" distR="0" wp14:anchorId="480314BB" wp14:editId="2FB856F7">
-            <wp:extent cx="5486400" cy="2728595"/>
-            <wp:effectExtent l="0" t="0" r="0" b="0"/>
-            <wp:docPr id="499334942" name="Picture 1"/>
+          <wp:inline distT="0" distB="0" distL="0" distR="0" wp14:anchorId="7C1CA068" wp14:editId="029B7F93">
+            <wp:extent cx="5620858" cy="2792437"/>
+            <wp:effectExtent l="0" t="0" r="0" b="8255"/>
+            <wp:docPr id="2047800929" name="Picture 1"/>
             <wp:cNvGraphicFramePr>
               <a:graphicFrameLocks xmlns:a="http://schemas.openxmlformats.org/drawingml/2006/main" noChangeAspect="1"/>
             </wp:cNvGraphicFramePr>
@@ -564,7 +616,7 @@
               <a:graphicData uri="http://schemas.openxmlformats.org/drawingml/2006/picture">
                 <pic:pic xmlns:pic="http://schemas.openxmlformats.org/drawingml/2006/picture">
                   <pic:nvPicPr>
-                    <pic:cNvPr id="499334942" name=""/>
+                    <pic:cNvPr id="2047800929" name=""/>
                     <pic:cNvPicPr/>
                   </pic:nvPicPr>
                   <pic:blipFill>
@@ -576,7 +628,7 @@
                   <pic:spPr>
                     <a:xfrm>
                       <a:off x="0" y="0"/>
-                      <a:ext cx="5486400" cy="2728595"/>
+                      <a:ext cx="5624993" cy="2794491"/>
                     </a:xfrm>
                     <a:prstGeom prst="rect">
                       <a:avLst/>
@@ -599,15 +651,11 @@
     </w:p>
     <w:p>
       <w:r>
-        <w:rPr>
-          <w:i/>
-          <w:color w:val="888888"/>
-        </w:rPr>
         <w:drawing>
-          <wp:inline distT="0" distB="0" distL="0" distR="0" wp14:anchorId="0623B6F6" wp14:editId="75D33E27">
-            <wp:extent cx="5486400" cy="2682240"/>
-            <wp:effectExtent l="0" t="0" r="0" b="3810"/>
-            <wp:docPr id="651855964" name="Picture 1"/>
+          <wp:inline distT="0" distB="0" distL="0" distR="0" wp14:anchorId="4F6B0DE6" wp14:editId="62B1964B">
+            <wp:extent cx="5486400" cy="2685415"/>
+            <wp:effectExtent l="0" t="0" r="0" b="635"/>
+            <wp:docPr id="1033325527" name="Picture 1"/>
             <wp:cNvGraphicFramePr>
               <a:graphicFrameLocks xmlns:a="http://schemas.openxmlformats.org/drawingml/2006/main" noChangeAspect="1"/>
             </wp:cNvGraphicFramePr>
@@ -615,7 +663,7 @@
               <a:graphicData uri="http://schemas.openxmlformats.org/drawingml/2006/picture">
                 <pic:pic xmlns:pic="http://schemas.openxmlformats.org/drawingml/2006/picture">
                   <pic:nvPicPr>
-                    <pic:cNvPr id="651855964" name=""/>
+                    <pic:cNvPr id="1033325527" name=""/>
                     <pic:cNvPicPr/>
                   </pic:nvPicPr>
                   <pic:blipFill>
@@ -627,7 +675,7 @@
                   <pic:spPr>
                     <a:xfrm>
                       <a:off x="0" y="0"/>
-                      <a:ext cx="5486400" cy="2682240"/>
+                      <a:ext cx="5486400" cy="2685415"/>
                     </a:xfrm>
                     <a:prstGeom prst="rect">
                       <a:avLst/>
@@ -651,15 +699,11 @@
     </w:p>
     <w:p>
       <w:r>
-        <w:rPr>
-          <w:i/>
-          <w:color w:val="888888"/>
-        </w:rPr>
         <w:drawing>
-          <wp:inline distT="0" distB="0" distL="0" distR="0" wp14:anchorId="49CF1561" wp14:editId="4C148364">
-            <wp:extent cx="5486400" cy="2428875"/>
-            <wp:effectExtent l="0" t="0" r="0" b="9525"/>
-            <wp:docPr id="660926694" name="Picture 1"/>
+          <wp:inline distT="0" distB="0" distL="0" distR="0" wp14:anchorId="5B0D2917" wp14:editId="511566A7">
+            <wp:extent cx="5486400" cy="2410460"/>
+            <wp:effectExtent l="0" t="0" r="0" b="8890"/>
+            <wp:docPr id="1313317137" name="Picture 1"/>
             <wp:cNvGraphicFramePr>
               <a:graphicFrameLocks xmlns:a="http://schemas.openxmlformats.org/drawingml/2006/main" noChangeAspect="1"/>
             </wp:cNvGraphicFramePr>
@@ -667,7 +711,7 @@
               <a:graphicData uri="http://schemas.openxmlformats.org/drawingml/2006/picture">
                 <pic:pic xmlns:pic="http://schemas.openxmlformats.org/drawingml/2006/picture">
                   <pic:nvPicPr>
-                    <pic:cNvPr id="660926694" name=""/>
+                    <pic:cNvPr id="1313317137" name=""/>
                     <pic:cNvPicPr/>
                   </pic:nvPicPr>
                   <pic:blipFill>
@@ -679,7 +723,7 @@
                   <pic:spPr>
                     <a:xfrm>
                       <a:off x="0" y="0"/>
-                      <a:ext cx="5486400" cy="2428875"/>
+                      <a:ext cx="5486400" cy="2410460"/>
                     </a:xfrm>
                     <a:prstGeom prst="rect">
                       <a:avLst/>
@@ -702,15 +746,11 @@
     </w:p>
     <w:p>
       <w:r>
-        <w:rPr>
-          <w:i/>
-          <w:color w:val="888888"/>
-        </w:rPr>
         <w:drawing>
-          <wp:inline distT="0" distB="0" distL="0" distR="0" wp14:anchorId="4D8D2C1D" wp14:editId="22898193">
-            <wp:extent cx="5486400" cy="2451100"/>
-            <wp:effectExtent l="0" t="0" r="0" b="6350"/>
-            <wp:docPr id="1033280950" name="Picture 1"/>
+          <wp:inline distT="0" distB="0" distL="0" distR="0" wp14:anchorId="4B8D9D9F" wp14:editId="787F7CD1">
+            <wp:extent cx="5486400" cy="2538095"/>
+            <wp:effectExtent l="0" t="0" r="0" b="0"/>
+            <wp:docPr id="1973404883" name="Picture 1"/>
             <wp:cNvGraphicFramePr>
               <a:graphicFrameLocks xmlns:a="http://schemas.openxmlformats.org/drawingml/2006/main" noChangeAspect="1"/>
             </wp:cNvGraphicFramePr>
@@ -718,7 +758,7 @@
               <a:graphicData uri="http://schemas.openxmlformats.org/drawingml/2006/picture">
                 <pic:pic xmlns:pic="http://schemas.openxmlformats.org/drawingml/2006/picture">
                   <pic:nvPicPr>
-                    <pic:cNvPr id="1033280950" name=""/>
+                    <pic:cNvPr id="1973404883" name=""/>
                     <pic:cNvPicPr/>
                   </pic:nvPicPr>
                   <pic:blipFill>
@@ -730,7 +770,7 @@
                   <pic:spPr>
                     <a:xfrm>
                       <a:off x="0" y="0"/>
-                      <a:ext cx="5486400" cy="2451100"/>
+                      <a:ext cx="5486400" cy="2538095"/>
                     </a:xfrm>
                     <a:prstGeom prst="rect">
                       <a:avLst/>
@@ -2328,6 +2368,7 @@
   <w:style w:type="character" w:default="1" w:styleId="DefaultParagraphFont">
     <w:name w:val="Default Paragraph Font"/>
     <w:uiPriority w:val="1"/>
+    <w:semiHidden/>
     <w:unhideWhenUsed/>
   </w:style>
   <w:style w:type="table" w:default="1" w:styleId="TableNormal">
@@ -13697,12 +13738,7 @@
 </file>
 
 <file path=customXml/item2.xml><?xml version="1.0" encoding="utf-8"?>
-<?mso-contentType ?>
-<FormTemplates xmlns="http://schemas.microsoft.com/sharepoint/v3/contenttype/forms">
-  <Display>DocumentLibraryForm</Display>
-  <Edit>DocumentLibraryForm</Edit>
-  <New>DocumentLibraryForm</New>
-</FormTemplates>
+<b:Sources xmlns:b="http://schemas.openxmlformats.org/officeDocument/2006/bibliography" xmlns="http://schemas.openxmlformats.org/officeDocument/2006/bibliography" SelectedStyle="/APA.XSL" StyleName="APA"/>
 </file>
 
 <file path=customXml/item3.xml><?xml version="1.0" encoding="utf-8"?>
@@ -13719,7 +13755,12 @@
 </file>
 
 <file path=customXml/item4.xml><?xml version="1.0" encoding="utf-8"?>
-<b:Sources xmlns:b="http://schemas.openxmlformats.org/officeDocument/2006/bibliography" xmlns="http://schemas.openxmlformats.org/officeDocument/2006/bibliography" SelectedStyle="/APA.XSL" StyleName="APA"/>
+<?mso-contentType ?>
+<FormTemplates xmlns="http://schemas.microsoft.com/sharepoint/v3/contenttype/forms">
+  <Display>DocumentLibraryForm</Display>
+  <Edit>DocumentLibraryForm</Edit>
+  <New>DocumentLibraryForm</New>
+</FormTemplates>
 </file>
 
 <file path=customXml/itemProps1.xml><?xml version="1.0" encoding="utf-8"?>
@@ -13743,9 +13784,9 @@
 </file>
 
 <file path=customXml/itemProps2.xml><?xml version="1.0" encoding="utf-8"?>
-<ds:datastoreItem xmlns:ds="http://schemas.openxmlformats.org/officeDocument/2006/customXml" ds:itemID="{CEDA4C41-BA4A-4F0B-A87E-F30AA6591D91}">
+<ds:datastoreItem xmlns:ds="http://schemas.openxmlformats.org/officeDocument/2006/customXml" ds:itemID="{EF278816-EC6F-A645-907D-7F25AECB1D4A}">
   <ds:schemaRefs>
-    <ds:schemaRef ds:uri="http://schemas.microsoft.com/sharepoint/v3/contenttype/forms"/>
+    <ds:schemaRef ds:uri="http://schemas.openxmlformats.org/officeDocument/2006/bibliography"/>
   </ds:schemaRefs>
 </ds:datastoreItem>
 </file>
@@ -13763,9 +13804,9 @@
 </file>
 
 <file path=customXml/itemProps4.xml><?xml version="1.0" encoding="utf-8"?>
-<ds:datastoreItem xmlns:ds="http://schemas.openxmlformats.org/officeDocument/2006/customXml" ds:itemID="{EF278816-EC6F-A645-907D-7F25AECB1D4A}">
+<ds:datastoreItem xmlns:ds="http://schemas.openxmlformats.org/officeDocument/2006/customXml" ds:itemID="{CEDA4C41-BA4A-4F0B-A87E-F30AA6591D91}">
   <ds:schemaRefs>
-    <ds:schemaRef ds:uri="http://schemas.openxmlformats.org/officeDocument/2006/bibliography"/>
+    <ds:schemaRef ds:uri="http://schemas.microsoft.com/sharepoint/v3/contenttype/forms"/>
   </ds:schemaRefs>
 </ds:datastoreItem>
 </file>

</xml_diff>